<commit_message>
Briefing document: remove the 'Where David fits' page
Co-Authored-By: Claude Opus 5.5 <noreply@anthropic.com>
Claude-Session: https://claude.ai/code/session_01CFjizt5zjDrPrNkUDYBzBn
</commit_message>
<xml_diff>
--- a/decks/david-samuel/Extol-x-David-Samuel-Briefing.docx
+++ b/decks/david-samuel/Extol-x-David-Samuel-Briefing.docx
@@ -2822,340 +2822,6 @@
         </w:tc>
       </w:tr>
     </w:tbl>
-    <w:p>
-      <w:pPr>
-        <w:pageBreakBefore/>
-        <w:spacing w:after="120" w:before="0" w:line="276"/>
-      </w:pPr>
-      <w:r>
-        <w:rPr>
-          <w:rFonts w:ascii="DM Mono" w:cs="DM Mono" w:eastAsia="DM Mono" w:hAnsi="DM Mono"/>
-          <w:color w:val="2B4A34"/>
-          <w:sz w:val="19"/>
-          <w:szCs w:val="19"/>
-        </w:rPr>
-        <w:t xml:space="preserve">09 · WHAT COMES NEXT</w:t>
-      </w:r>
-    </w:p>
-    <w:p>
-      <w:pPr>
-        <w:spacing w:after="360" w:before="0" w:line="994" w:lineRule="exact"/>
-      </w:pPr>
-      <w:r>
-        <w:rPr>
-          <w:rFonts w:ascii="DM Sans" w:cs="DM Sans" w:eastAsia="DM Sans" w:hAnsi="DM Sans"/>
-          <w:color w:val="101F14"/>
-          <w:sz w:val="86"/>
-          <w:szCs w:val="86"/>
-        </w:rPr>
-        <w:t xml:space="preserve">Where David fits</w:t>
-      </w:r>
-    </w:p>
-    <w:p>
-      <w:pPr>
-        <w:spacing w:after="1050" w:before="0" w:line="414" w:lineRule="exact"/>
-      </w:pPr>
-      <w:r>
-        <w:rPr>
-          <w:rFonts w:ascii="DM Sans" w:cs="DM Sans" w:eastAsia="DM Sans" w:hAnsi="DM Sans"/>
-          <w:color w:val="5B6B5E"/>
-          <w:sz w:val="36"/>
-          <w:szCs w:val="36"/>
-        </w:rPr>
-        <w:t xml:space="preserve">Three ways to help us grow.</w:t>
-      </w:r>
-    </w:p>
-    <w:tbl>
-      <w:tblPr>
-        <w:tblW w:type="dxa" w:w="9638"/>
-        <w:tblBorders>
-          <w:top w:val="none" w:color="FFFFFF" w:sz="0"/>
-          <w:left w:val="none" w:color="FFFFFF" w:sz="0"/>
-          <w:bottom w:val="none" w:color="FFFFFF" w:sz="0"/>
-          <w:right w:val="none" w:color="FFFFFF" w:sz="0"/>
-          <w:insideH w:val="none" w:color="FFFFFF" w:sz="0"/>
-          <w:insideV w:val="none" w:color="FFFFFF" w:sz="0"/>
-        </w:tblBorders>
-        <w:tblLayout w:type="fixed"/>
-      </w:tblPr>
-      <w:tblGrid>
-        <w:gridCol w:w="3106"/>
-        <w:gridCol w:w="160"/>
-        <w:gridCol w:w="3106"/>
-        <w:gridCol w:w="160"/>
-        <w:gridCol w:w="3106"/>
-      </w:tblGrid>
-      <w:tr>
-        <w:trPr>
-          <w:cantSplit/>
-        </w:trPr>
-        <w:tc>
-          <w:tcPr>
-            <w:tcW w:type="dxa" w:w="3106"/>
-            <w:tcBorders>
-              <w:top w:val="none" w:color="FFFFFF" w:sz="0"/>
-              <w:left w:val="none" w:color="FFFFFF" w:sz="0"/>
-              <w:bottom w:val="none" w:color="FFFFFF" w:sz="0"/>
-              <w:right w:val="none" w:color="FFFFFF" w:sz="0"/>
-            </w:tcBorders>
-            <w:shd w:fill="F6F8EC" w:color="auto" w:val="clear"/>
-            <w:tcMar>
-              <w:top w:type="dxa" w:w="520"/>
-              <w:left w:type="dxa" w:w="260"/>
-              <w:bottom w:type="dxa" w:w="520"/>
-              <w:right w:type="dxa" w:w="260"/>
-            </w:tcMar>
-            <w:vAlign w:val="top"/>
-          </w:tcPr>
-          <w:p>
-            <w:pPr>
-              <w:spacing w:after="240" w:before="0" w:line="276"/>
-            </w:pPr>
-            <w:r>
-              <w:rPr>
-                <w:rFonts w:ascii="DM Mono" w:cs="DM Mono" w:eastAsia="DM Mono" w:hAnsi="DM Mono"/>
-                <w:color w:val="7E9C6B"/>
-                <w:sz w:val="19"/>
-                <w:szCs w:val="19"/>
-              </w:rPr>
-              <w:t xml:space="preserve">ADVISE</w:t>
-            </w:r>
-          </w:p>
-          <w:p>
-            <w:pPr>
-              <w:spacing w:after="0" w:before="0" w:line="442" w:lineRule="exact"/>
-            </w:pPr>
-            <w:r>
-              <w:rPr>
-                <w:rFonts w:ascii="DM Sans" w:cs="DM Sans" w:eastAsia="DM Sans" w:hAnsi="DM Sans"/>
-                <w:color w:val="101F14"/>
-                <w:sz w:val="38"/>
-                <w:szCs w:val="38"/>
-              </w:rPr>
-              <w:t xml:space="preserve">Sharpen our offer and pitch</w:t>
-            </w:r>
-          </w:p>
-        </w:tc>
-        <w:tc>
-          <w:tcPr>
-            <w:tcW w:type="dxa" w:w="160"/>
-            <w:tcBorders>
-              <w:top w:val="none" w:color="FFFFFF" w:sz="0"/>
-              <w:left w:val="none" w:color="FFFFFF" w:sz="0"/>
-              <w:bottom w:val="none" w:color="FFFFFF" w:sz="0"/>
-              <w:right w:val="none" w:color="FFFFFF" w:sz="0"/>
-            </w:tcBorders>
-            <w:tcMar>
-              <w:top w:type="dxa" w:w="0"/>
-              <w:left w:type="dxa" w:w="0"/>
-              <w:bottom w:type="dxa" w:w="0"/>
-              <w:right w:type="dxa" w:w="0"/>
-            </w:tcMar>
-            <w:vAlign w:val="top"/>
-          </w:tcPr>
-          <w:p>
-            <w:pPr>
-              <w:spacing w:after="180" w:before="0" w:line="276"/>
-            </w:pPr>
-            <w:r>
-              <w:rPr>
-                <w:rFonts w:ascii="DM Sans" w:cs="DM Sans" w:eastAsia="DM Sans" w:hAnsi="DM Sans"/>
-                <w:color w:val="101F14"/>
-                <w:sz w:val="25"/>
-                <w:szCs w:val="25"/>
-              </w:rPr>
-              <w:t xml:space="preserve"/>
-            </w:r>
-          </w:p>
-        </w:tc>
-        <w:tc>
-          <w:tcPr>
-            <w:tcW w:type="dxa" w:w="3106"/>
-            <w:tcBorders>
-              <w:top w:val="none" w:color="FFFFFF" w:sz="0"/>
-              <w:left w:val="none" w:color="FFFFFF" w:sz="0"/>
-              <w:bottom w:val="none" w:color="FFFFFF" w:sz="0"/>
-              <w:right w:val="none" w:color="FFFFFF" w:sz="0"/>
-            </w:tcBorders>
-            <w:shd w:fill="E9F0C9" w:color="auto" w:val="clear"/>
-            <w:tcMar>
-              <w:top w:type="dxa" w:w="520"/>
-              <w:left w:type="dxa" w:w="260"/>
-              <w:bottom w:type="dxa" w:w="520"/>
-              <w:right w:type="dxa" w:w="260"/>
-            </w:tcMar>
-            <w:vAlign w:val="top"/>
-          </w:tcPr>
-          <w:p>
-            <w:pPr>
-              <w:spacing w:after="240" w:before="0" w:line="276"/>
-            </w:pPr>
-            <w:r>
-              <w:rPr>
-                <w:rFonts w:ascii="DM Mono" w:cs="DM Mono" w:eastAsia="DM Mono" w:hAnsi="DM Mono"/>
-                <w:color w:val="7E9C6B"/>
-                <w:sz w:val="19"/>
-                <w:szCs w:val="19"/>
-              </w:rPr>
-              <w:t xml:space="preserve">GUIDE</w:t>
-            </w:r>
-          </w:p>
-          <w:p>
-            <w:pPr>
-              <w:spacing w:after="0" w:before="0" w:line="442" w:lineRule="exact"/>
-            </w:pPr>
-            <w:r>
-              <w:rPr>
-                <w:rFonts w:ascii="DM Sans" w:cs="DM Sans" w:eastAsia="DM Sans" w:hAnsi="DM Sans"/>
-                <w:color w:val="101F14"/>
-                <w:sz w:val="38"/>
-                <w:szCs w:val="38"/>
-              </w:rPr>
-              <w:t xml:space="preserve">Pick the one market to own</w:t>
-            </w:r>
-          </w:p>
-        </w:tc>
-        <w:tc>
-          <w:tcPr>
-            <w:tcW w:type="dxa" w:w="160"/>
-            <w:tcBorders>
-              <w:top w:val="none" w:color="FFFFFF" w:sz="0"/>
-              <w:left w:val="none" w:color="FFFFFF" w:sz="0"/>
-              <w:bottom w:val="none" w:color="FFFFFF" w:sz="0"/>
-              <w:right w:val="none" w:color="FFFFFF" w:sz="0"/>
-            </w:tcBorders>
-            <w:tcMar>
-              <w:top w:type="dxa" w:w="0"/>
-              <w:left w:type="dxa" w:w="0"/>
-              <w:bottom w:type="dxa" w:w="0"/>
-              <w:right w:type="dxa" w:w="0"/>
-            </w:tcMar>
-            <w:vAlign w:val="top"/>
-          </w:tcPr>
-          <w:p>
-            <w:pPr>
-              <w:spacing w:after="180" w:before="0" w:line="276"/>
-            </w:pPr>
-            <w:r>
-              <w:rPr>
-                <w:rFonts w:ascii="DM Sans" w:cs="DM Sans" w:eastAsia="DM Sans" w:hAnsi="DM Sans"/>
-                <w:color w:val="101F14"/>
-                <w:sz w:val="25"/>
-                <w:szCs w:val="25"/>
-              </w:rPr>
-              <w:t xml:space="preserve"/>
-            </w:r>
-          </w:p>
-        </w:tc>
-        <w:tc>
-          <w:tcPr>
-            <w:tcW w:type="dxa" w:w="3106"/>
-            <w:tcBorders>
-              <w:top w:val="none" w:color="FFFFFF" w:sz="0"/>
-              <w:left w:val="none" w:color="FFFFFF" w:sz="0"/>
-              <w:bottom w:val="none" w:color="FFFFFF" w:sz="0"/>
-              <w:right w:val="none" w:color="FFFFFF" w:sz="0"/>
-            </w:tcBorders>
-            <w:shd w:fill="F6F8EC" w:color="auto" w:val="clear"/>
-            <w:tcMar>
-              <w:top w:type="dxa" w:w="520"/>
-              <w:left w:type="dxa" w:w="260"/>
-              <w:bottom w:type="dxa" w:w="520"/>
-              <w:right w:type="dxa" w:w="260"/>
-            </w:tcMar>
-            <w:vAlign w:val="top"/>
-          </w:tcPr>
-          <w:p>
-            <w:pPr>
-              <w:spacing w:after="240" w:before="0" w:line="276"/>
-            </w:pPr>
-            <w:r>
-              <w:rPr>
-                <w:rFonts w:ascii="DM Mono" w:cs="DM Mono" w:eastAsia="DM Mono" w:hAnsi="DM Mono"/>
-                <w:color w:val="7E9C6B"/>
-                <w:sz w:val="19"/>
-                <w:szCs w:val="19"/>
-              </w:rPr>
-              <w:t xml:space="preserve">CONNECT</w:t>
-            </w:r>
-          </w:p>
-          <w:p>
-            <w:pPr>
-              <w:spacing w:after="0" w:before="0" w:line="442" w:lineRule="exact"/>
-            </w:pPr>
-            <w:r>
-              <w:rPr>
-                <w:rFonts w:ascii="DM Sans" w:cs="DM Sans" w:eastAsia="DM Sans" w:hAnsi="DM Sans"/>
-                <w:color w:val="101F14"/>
-                <w:sz w:val="38"/>
-                <w:szCs w:val="38"/>
-              </w:rPr>
-              <w:t xml:space="preserve">Introduce us to the right people</w:t>
-            </w:r>
-          </w:p>
-        </w:tc>
-      </w:tr>
-    </w:tbl>
-    <w:p>
-      <w:pPr>
-        <w:spacing w:after="900"/>
-      </w:pPr>
-    </w:p>
-    <w:tbl>
-      <w:tblPr>
-        <w:tblW w:type="dxa" w:w="9638"/>
-        <w:tblBorders>
-          <w:top w:val="none" w:color="FFFFFF" w:sz="0"/>
-          <w:left w:val="none" w:color="FFFFFF" w:sz="0"/>
-          <w:bottom w:val="none" w:color="FFFFFF" w:sz="0"/>
-          <w:right w:val="none" w:color="FFFFFF" w:sz="0"/>
-          <w:insideH w:val="none" w:color="FFFFFF" w:sz="0"/>
-          <w:insideV w:val="none" w:color="FFFFFF" w:sz="0"/>
-        </w:tblBorders>
-        <w:tblLayout w:type="fixed"/>
-      </w:tblPr>
-      <w:tblGrid>
-        <w:gridCol w:w="9638"/>
-      </w:tblGrid>
-      <w:tr>
-        <w:trPr>
-          <w:cantSplit/>
-        </w:trPr>
-        <w:tc>
-          <w:tcPr>
-            <w:tcW w:type="dxa" w:w="9638"/>
-            <w:tcBorders>
-              <w:top w:val="none" w:color="FFFFFF" w:sz="0"/>
-              <w:left w:val="none" w:color="FFFFFF" w:sz="0"/>
-              <w:bottom w:val="none" w:color="FFFFFF" w:sz="0"/>
-              <w:right w:val="none" w:color="FFFFFF" w:sz="0"/>
-            </w:tcBorders>
-            <w:shd w:fill="1D3524" w:color="auto" w:val="clear"/>
-            <w:tcMar>
-              <w:top w:type="dxa" w:w="220"/>
-              <w:left w:type="dxa" w:w="300"/>
-              <w:bottom w:type="dxa" w:w="220"/>
-              <w:right w:type="dxa" w:w="300"/>
-            </w:tcMar>
-            <w:vAlign w:val="top"/>
-          </w:tcPr>
-          <w:p>
-            <w:pPr>
-              <w:spacing w:after="0" w:before="0" w:line="497" w:lineRule="exact"/>
-            </w:pPr>
-            <w:r>
-              <w:rPr>
-                <w:rFonts w:ascii="DM Sans" w:cs="DM Sans" w:eastAsia="DM Sans" w:hAnsi="DM Sans"/>
-                <w:color w:val="E9F0C9"/>
-                <w:sz w:val="43"/>
-                <w:szCs w:val="43"/>
-              </w:rPr>
-              <w:t xml:space="preserve">You know the people. We build the system.</w:t>
-            </w:r>
-          </w:p>
-        </w:tc>
-      </w:tr>
-    </w:tbl>
     <w:sectPr>
       <w:footerReference w:type="default" r:id="rId7"/>
       <w:pgSz w:w="11906" w:h="16838" w:orient="portrait"/>
@@ -3237,7 +2903,7 @@
       <w:instrText xml:space="preserve">PAGE</w:instrText>
       <w:fldChar w:fldCharType="separate"/>
       <w:fldChar w:fldCharType="end"/>
-      <w:t xml:space="preserve"> / 10</w:t>
+      <w:t xml:space="preserve"> / 9</w:t>
     </w:r>
   </w:p>
 </w:ftr>

</xml_diff>